<commit_message>
corrected model overview table
</commit_message>
<xml_diff>
--- a/results/tables/master_model_design_table_clean/master_model_design_table_clean.docx
+++ b/results/tables/master_model_design_table_clean/master_model_design_table_clean.docx
@@ -135,6 +135,7 @@
             <w:tcBorders>
               <w:top w:val="single" w:sz="16" w:space="0" w:color="D3D3D3"/>
               <w:bottom w:val="single" w:sz="16" w:space="0" w:color="D3D3D3"/>
+              <w:end w:val="single" w:space="0" w:color="D3D3D3"/>
             </w:tcBorders>
           </w:tcPr>
           <w:p>
@@ -149,29 +150,6 @@
                 <w:sz w:val="20"/>
               </w:rPr>
               <w:t xml:space="default">Key Result</w:t>
-            </w:r>
-          </w:p>
-        </w:tc>
-        <w:tc>
-          <w:tcPr>
-            <w:tcBorders>
-              <w:top w:val="single" w:sz="16" w:space="0" w:color="D3D3D3"/>
-              <w:bottom w:val="single" w:sz="16" w:space="0" w:color="D3D3D3"/>
-              <w:end w:val="single" w:space="0" w:color="D3D3D3"/>
-            </w:tcBorders>
-          </w:tcPr>
-          <w:p>
-            <w:pPr>
-              <w:spacing w:before="0" w:after="60"/>
-              <w:keepNext/>
-              <w:jc w:val="start"/>
-            </w:pPr>
-            <w:r>
-              <w:rPr>
-                <w:rFonts w:ascii="Calibri" w:hAnsi="Calibri"/>
-                <w:sz w:val="20"/>
-              </w:rPr>
-              <w:t xml:space="default">Analysis Phase</w:t>
             </w:r>
           </w:p>
         </w:tc>
@@ -333,30 +311,6 @@
             </w:r>
           </w:p>
         </w:tc>
-        <w:tc>
-          <w:tcPr>
-            <w:tcBorders>
-              <w:top w:val="single" w:space="0" w:color="D3D3D3"/>
-              <w:bottom w:val="single" w:space="0" w:color="D3D3D3"/>
-              <w:start w:val="single" w:space="0" w:color="D3D3D3"/>
-              <w:end w:val="single" w:space="0" w:color="D3D3D3"/>
-            </w:tcBorders>
-          </w:tcPr>
-          <w:p>
-            <w:pPr>
-              <w:spacing w:before="0" w:after="60"/>
-              <w:keepNext/>
-              <w:jc w:val="start"/>
-            </w:pPr>
-            <w:r>
-              <w:rPr>
-                <w:rFonts w:ascii="Calibri" w:hAnsi="Calibri"/>
-                <w:sz w:val="20"/>
-              </w:rPr>
-              <w:t xml:space="default">Field Application</w:t>
-            </w:r>
-          </w:p>
-        </w:tc>
       </w:tr>
       <w:tr>
         <w:trPr>
@@ -525,30 +479,6 @@
             </w:r>
           </w:p>
         </w:tc>
-        <w:tc>
-          <w:tcPr>
-            <w:tcBorders>
-              <w:top w:val="single" w:space="0" w:color="D3D3D3"/>
-              <w:bottom w:val="single" w:space="0" w:color="D3D3D3"/>
-              <w:start w:val="single" w:space="0" w:color="D3D3D3"/>
-              <w:end w:val="single" w:space="0" w:color="D3D3D3"/>
-            </w:tcBorders>
-          </w:tcPr>
-          <w:p>
-            <w:pPr>
-              <w:spacing w:before="0" w:after="60"/>
-              <w:keepNext/>
-              <w:jc w:val="start"/>
-            </w:pPr>
-            <w:r>
-              <w:rPr>
-                <w:rFonts w:ascii="Calibri" w:hAnsi="Calibri"/>
-                <w:sz w:val="20"/>
-              </w:rPr>
-              <w:t xml:space="default">Hybrid Analysis</w:t>
-            </w:r>
-          </w:p>
-        </w:tc>
       </w:tr>
       <w:tr>
         <w:trPr>
@@ -716,30 +646,6 @@
             </w:r>
           </w:p>
         </w:tc>
-        <w:tc>
-          <w:tcPr>
-            <w:tcBorders>
-              <w:top w:val="single" w:space="0" w:color="D3D3D3"/>
-              <w:bottom w:val="single" w:space="0" w:color="D3D3D3"/>
-              <w:start w:val="single" w:space="0" w:color="D3D3D3"/>
-              <w:end w:val="single" w:space="0" w:color="D3D3D3"/>
-            </w:tcBorders>
-          </w:tcPr>
-          <w:p>
-            <w:pPr>
-              <w:spacing w:before="0" w:after="60"/>
-              <w:keepNext/>
-              <w:jc w:val="start"/>
-            </w:pPr>
-            <w:r>
-              <w:rPr>
-                <w:rFonts w:ascii="Calibri" w:hAnsi="Calibri"/>
-                <w:sz w:val="20"/>
-              </w:rPr>
-              <w:t xml:space="default">Hybrid Analysis</w:t>
-            </w:r>
-          </w:p>
-        </w:tc>
       </w:tr>
       <w:tr>
         <w:trPr>
@@ -908,30 +814,6 @@
             </w:r>
           </w:p>
         </w:tc>
-        <w:tc>
-          <w:tcPr>
-            <w:tcBorders>
-              <w:top w:val="single" w:space="0" w:color="D3D3D3"/>
-              <w:bottom w:val="single" w:space="0" w:color="D3D3D3"/>
-              <w:start w:val="single" w:space="0" w:color="D3D3D3"/>
-              <w:end w:val="single" w:space="0" w:color="D3D3D3"/>
-            </w:tcBorders>
-          </w:tcPr>
-          <w:p>
-            <w:pPr>
-              <w:spacing w:before="0" w:after="60"/>
-              <w:keepNext/>
-              <w:jc w:val="start"/>
-            </w:pPr>
-            <w:r>
-              <w:rPr>
-                <w:rFonts w:ascii="Calibri" w:hAnsi="Calibri"/>
-                <w:sz w:val="20"/>
-              </w:rPr>
-              <w:t xml:space="default">Hybrid Analysis</w:t>
-            </w:r>
-          </w:p>
-        </w:tc>
       </w:tr>
       <w:tr>
         <w:trPr>
@@ -1081,30 +963,6 @@
             </w:r>
           </w:p>
         </w:tc>
-        <w:tc>
-          <w:tcPr>
-            <w:tcBorders>
-              <w:top w:val="single" w:space="0" w:color="D3D3D3"/>
-              <w:bottom w:val="single" w:space="0" w:color="D3D3D3"/>
-              <w:start w:val="single" w:space="0" w:color="D3D3D3"/>
-              <w:end w:val="single" w:space="0" w:color="D3D3D3"/>
-            </w:tcBorders>
-          </w:tcPr>
-          <w:p>
-            <w:pPr>
-              <w:spacing w:before="0" w:after="60"/>
-              <w:keepNext/>
-              <w:jc w:val="start"/>
-            </w:pPr>
-            <w:r>
-              <w:rPr>
-                <w:rFonts w:ascii="Calibri" w:hAnsi="Calibri"/>
-                <w:sz w:val="20"/>
-              </w:rPr>
-              <w:t xml:space="default">Linear Regression</w:t>
-            </w:r>
-          </w:p>
-        </w:tc>
       </w:tr>
       <w:tr>
         <w:trPr>
@@ -1255,30 +1113,6 @@
             </w:r>
           </w:p>
         </w:tc>
-        <w:tc>
-          <w:tcPr>
-            <w:tcBorders>
-              <w:top w:val="single" w:space="0" w:color="D3D3D3"/>
-              <w:bottom w:val="single" w:space="0" w:color="D3D3D3"/>
-              <w:start w:val="single" w:space="0" w:color="D3D3D3"/>
-              <w:end w:val="single" w:space="0" w:color="D3D3D3"/>
-            </w:tcBorders>
-          </w:tcPr>
-          <w:p>
-            <w:pPr>
-              <w:spacing w:before="0" w:after="60"/>
-              <w:keepNext/>
-              <w:jc w:val="start"/>
-            </w:pPr>
-            <w:r>
-              <w:rPr>
-                <w:rFonts w:ascii="Calibri" w:hAnsi="Calibri"/>
-                <w:sz w:val="20"/>
-              </w:rPr>
-              <w:t xml:space="default">Linear Regression</w:t>
-            </w:r>
-          </w:p>
-        </w:tc>
       </w:tr>
       <w:tr>
         <w:trPr>
@@ -1429,30 +1263,6 @@
             </w:r>
           </w:p>
         </w:tc>
-        <w:tc>
-          <w:tcPr>
-            <w:tcBorders>
-              <w:top w:val="single" w:space="0" w:color="D3D3D3"/>
-              <w:bottom w:val="single" w:space="0" w:color="D3D3D3"/>
-              <w:start w:val="single" w:space="0" w:color="D3D3D3"/>
-              <w:end w:val="single" w:space="0" w:color="D3D3D3"/>
-            </w:tcBorders>
-          </w:tcPr>
-          <w:p>
-            <w:pPr>
-              <w:spacing w:before="0" w:after="60"/>
-              <w:keepNext/>
-              <w:jc w:val="start"/>
-            </w:pPr>
-            <w:r>
-              <w:rPr>
-                <w:rFonts w:ascii="Calibri" w:hAnsi="Calibri"/>
-                <w:sz w:val="20"/>
-              </w:rPr>
-              <w:t xml:space="default">Linear Regression</w:t>
-            </w:r>
-          </w:p>
-        </w:tc>
       </w:tr>
       <w:tr>
         <w:trPr>
@@ -1460,7 +1270,7 @@
         </w:trPr>
         <w:tc>
           <w:tcPr>
-            <w:gridSpan w:val="7"/>
+            <w:gridSpan w:val="6"/>
           </w:tcPr>
           <w:p>
             <w:pPr>
@@ -1483,7 +1293,7 @@
         </w:trPr>
         <w:tc>
           <w:tcPr>
-            <w:gridSpan w:val="7"/>
+            <w:gridSpan w:val="6"/>
           </w:tcPr>
           <w:p>
             <w:pPr>
@@ -1515,7 +1325,7 @@
         </w:trPr>
         <w:tc>
           <w:tcPr>
-            <w:gridSpan w:val="7"/>
+            <w:gridSpan w:val="6"/>
           </w:tcPr>
           <w:p>
             <w:pPr>
@@ -1547,7 +1357,7 @@
         </w:trPr>
         <w:tc>
           <w:tcPr>
-            <w:gridSpan w:val="7"/>
+            <w:gridSpan w:val="6"/>
           </w:tcPr>
           <w:p>
             <w:pPr>

</xml_diff>